<commit_message>
Retire Eventhouse Knowledge Operations Agent
Remove Eventhouse-only provisioning and seed settings; add identity-checked retirement with deletion/settings readback while preserving the ontology agent and shared alert dependencies. Synchronize notebook mirrors, instructions, workflow documentation, regression tests, and verified live cleanup evidence.

Co-authored-by: Copilot <223556219+Copilot@users.noreply.github.com>
</commit_message>
<xml_diff>
--- a/Raw/RTI_Ontology_Workflow_clean.docx
+++ b/Raw/RTI_Ontology_Workflow_clean.docx
@@ -386,7 +386,7 @@
               <w:rPr>
                 <w:sz w:val="18"/>
               </w:rPr>
-              <w:t>Dashboard / default-enabled Data Agent and Operations Agent / playbook, actions, Teams, and email-alert provisioning / SQL and GraphQL setup. See readiness rules below.</w:t>
+              <w:t>Dashboard / required Data Agent and ontology-backed Operations Agent / playbook, actions, Teams, and email-alert provisioning / retirement of the separate Eventhouse-Knowledge agent / SQL and GraphQL setup. See readiness rules below.</w:t>
             </w:r>
           </w:p>
         </w:tc>
@@ -1106,7 +1106,7 @@
         <w:t xml:space="preserve">010 - Operations Agent and alerts. </w:t>
       </w:r>
       <w:r>
-        <w:t>ontology_operations_agent_mode defaults to enabled; auto also attempts actual provisioning and only disabled opts out. The original Operations Agent, playbook/actions, Teams configuration, and Pipe_SendEmailAlert provisioning are retained against the verified v2 ontology. Required failures propagate, not successful static skips. Configure the run-as identity and Teams destination; email delivery requires the manually created Office 365 Outlook OAuth2 mailbox connection. Strict readback records ops_agent_deployment_status=configured with the agent stopped, not runtime tested. OperationsAgentV1 names the retained business-configuration schema, not ontology generation 1. Item creation is not proof of playbook execution or alert delivery. Known issue 1970 and other external product issues are not claimed resolved by restoring this implementation.</w:t>
+        <w:t>Always provision the original ontology-backed Operations Agent; there are no agent mode or skip flags. Its verified v2 Knowledge source, SQL/KQL-grounded BAD/UNCERTAIN playbook, six direct email action bindings including event_time, Teams configuration, and Pipe_SendEmailAlert provisioning are retained. The separate Eventhouse-Knowledge Operations Agent is retired and never provisioned. After verifying the retained ontology agent, RTI_010 locates only RTI_Demo_OpsAgent_Eventhouse_&lt;suffix&gt; in the target folder, checks saved identity and the exact target KQL database source, deletes it, verifies absence, and removes its four eventhouse_ops_agent_* settings. Identity conflicts, deletion/readback failures, and settings cleanup failures propagate. Fresh RTI_001 runs no longer seed the retired name. Shared Eventhouse telemetry, silver tables, SQL/KQL grounding, Teams destination, Outlook connection, and email pipeline remain unchanged. Configure the run-as identity and Teams destination; email delivery requires an Office 365 Outlook OAuth2 mailbox connection created through interactive sign-in. Strict readback records ops_agent_deployment_status=configured with the retained agent stopped, not runtime tested. OperationsAgentV1 names the retained business-configuration schema, not ontology generation 1. Configuration is not proof of playbook execution or alert delivery. No timed alert cooldown or product-wide runtime fix is claimed.</w:t>
       </w:r>
     </w:p>
     <w:p>

</xml_diff>